<commit_message>
Add Stage 5 challenge and Vigenere puzzle
</commit_message>
<xml_diff>
--- a/Kernel0X_18Min_Presentation_Script.docx
+++ b/Kernel0X_18Min_Presentation_Script.docx
@@ -2162,7 +2162,7 @@
         <w:rPr>
           <w:sz w:val="20"/>
         </w:rPr>
-        <w:t>Explain Vigenère key derivation from the Stage 4 hostname (WAREHOUSE).</w:t>
+        <w:t>Explain Vigenère key derivation from the Stage 4 hostname and the 9-letter code deduction puzzle (WAREHOUSE).</w:t>
       </w:r>
     </w:p>
     <w:p>
@@ -2229,7 +2229,7 @@
         <w:rPr>
           <w:sz w:val="21"/>
         </w:rPr>
-        <w:t>Welcome back. I am [Member 3], presenting Stage 5: The Second Cipher, representing our advanced cryptography component. Unlike the monoalphabetic cipher in Stage 3, Stage 5 implements a polyalphabetic Vigenère cipher. Notice that our platform automatically loaded the exfiltrated ciphertext from Stage 4. Recall the hostname discovered by Member 2 in the FTP control traffic: ftp.warehouse9.nexalabs.local. The distinct keyword identifying this server is 'WAREHOUSE'. We test this keyword as our repeating Vigenère decryption key.</w:t>
+        <w:t>Welcome back. I am [Member 3], presenting Stage 5: The Second Cipher, representing our advanced cryptography component. Unlike the monoalphabetic cipher in Stage 3, Stage 5 implements a polyalphabetic Vigenère cipher. Notice that our platform automatically loaded the exfiltrated ciphertext from Stage 4. Recall the hostname discovered by Member 2 in the FTP control traffic: ftp.warehouse9.nexalabs.local. Furthermore, our portal presents a 9-letter word deduction puzzle—Crack The Code—confirming the exact keyword: 'WAREHOUSE'. We test this keyword as our repeating Vigenère decryption key.</w:t>
       </w:r>
     </w:p>
     <w:p>

</xml_diff>